<commit_message>
Include hosting study in corrected deliverable
</commit_message>
<xml_diff>
--- a/EdC-02-Livrable-corrige.docx
+++ b/EdC-02-Livrable-corrige.docx
@@ -7625,6 +7625,313 @@
         <w:pStyle w:val="Heading2"/>
       </w:pPr>
       <w:r>
+        <w:t>Étude d'hébergements responsables</w:t>
+      </w:r>
+    </w:p>
+    <w:p>
+      <w:r>
+        <w:t>Comparaison documentaire consultée le 6 octobre 2026. Les PUE mondiaux ne sont pas attribués à un site régional; le coût Scaleway est une référence compute, pas un TCO complet. Les offres et certifications dépendent des régions et produits souscrits.</w:t>
+      </w:r>
+    </w:p>
+    <w:tbl>
+      <w:tblPr>
+        <w:tblStyle w:val="Grilledutableau"/>
+        <w:tblW w:type="auto" w:w="0"/>
+        <w:jc w:val="center"/>
+        <w:tblLook w:firstColumn="1" w:firstRow="1" w:lastColumn="0" w:lastRow="0" w:noHBand="0" w:noVBand="1" w:val="04A0"/>
+      </w:tblPr>
+      <w:tblGrid>
+        <w:gridCol w:w="2268"/>
+        <w:gridCol w:w="2268"/>
+        <w:gridCol w:w="2268"/>
+        <w:gridCol w:w="2268"/>
+      </w:tblGrid>
+      <w:tr>
+        <w:tc>
+          <w:tcPr>
+            <w:tcW w:type="dxa" w:w="2268"/>
+          </w:tcPr>
+          <w:p>
+            <w:r>
+              <w:rPr>
+                <w:sz w:val="16"/>
+              </w:rPr>
+              <w:t>Option</w:t>
+            </w:r>
+          </w:p>
+        </w:tc>
+        <w:tc>
+          <w:tcPr>
+            <w:tcW w:type="dxa" w:w="2268"/>
+          </w:tcPr>
+          <w:p>
+            <w:r>
+              <w:rPr>
+                <w:sz w:val="16"/>
+              </w:rPr>
+              <w:t>Énergie / PUE</w:t>
+            </w:r>
+          </w:p>
+        </w:tc>
+        <w:tc>
+          <w:tcPr>
+            <w:tcW w:type="dxa" w:w="2268"/>
+          </w:tcPr>
+          <w:p>
+            <w:r>
+              <w:rPr>
+                <w:sz w:val="16"/>
+              </w:rPr>
+              <w:t>Certifications / souveraineté</w:t>
+            </w:r>
+          </w:p>
+        </w:tc>
+        <w:tc>
+          <w:tcPr>
+            <w:tcW w:type="dxa" w:w="2268"/>
+          </w:tcPr>
+          <w:p>
+            <w:r>
+              <w:rPr>
+                <w:sz w:val="16"/>
+              </w:rPr>
+              <w:t>Coût indicatif</w:t>
+            </w:r>
+          </w:p>
+        </w:tc>
+      </w:tr>
+      <w:tr>
+        <w:tc>
+          <w:tcPr>
+            <w:tcW w:type="dxa" w:w="2268"/>
+          </w:tcPr>
+          <w:p>
+            <w:r>
+              <w:rPr>
+                <w:sz w:val="16"/>
+              </w:rPr>
+              <w:t>AWS Paris / eu-west-3</w:t>
+            </w:r>
+          </w:p>
+        </w:tc>
+        <w:tc>
+          <w:tcPr>
+            <w:tcW w:type="dxa" w:w="2268"/>
+          </w:tcPr>
+          <w:p>
+            <w:r>
+              <w:rPr>
+                <w:sz w:val="16"/>
+              </w:rPr>
+              <w:t>PUE moyen mondial 2025 : 1,14; pas de valeur Paris ni de mix énergétique régional publié.</w:t>
+            </w:r>
+          </w:p>
+        </w:tc>
+        <w:tc>
+          <w:tcPr>
+            <w:tcW w:type="dxa" w:w="2268"/>
+          </w:tcPr>
+          <w:p>
+            <w:r>
+              <w:rPr>
+                <w:sz w:val="16"/>
+              </w:rPr>
+              <w:t>ISO 27001/14001 et autres attestations selon service. Région UE, mais groupe américain; analyser la juridiction.</w:t>
+            </w:r>
+          </w:p>
+        </w:tc>
+        <w:tc>
+          <w:tcPr>
+            <w:tcW w:type="dxa" w:w="2268"/>
+          </w:tcPr>
+          <w:p>
+            <w:r>
+              <w:rPr>
+                <w:sz w:val="16"/>
+              </w:rPr>
+              <w:t>À calculer au Pricing Calculator eu-west-3; ne pas transposer le tarif US East.</w:t>
+            </w:r>
+          </w:p>
+        </w:tc>
+      </w:tr>
+      <w:tr>
+        <w:tc>
+          <w:tcPr>
+            <w:tcW w:type="dxa" w:w="2268"/>
+          </w:tcPr>
+          <w:p>
+            <w:r>
+              <w:rPr>
+                <w:sz w:val="16"/>
+              </w:rPr>
+              <w:t>AWS Stockholm / eu-north-1</w:t>
+            </w:r>
+          </w:p>
+        </w:tc>
+        <w:tc>
+          <w:tcPr>
+            <w:tcW w:type="dxa" w:w="2268"/>
+          </w:tcPr>
+          <w:p>
+            <w:r>
+              <w:rPr>
+                <w:sz w:val="16"/>
+              </w:rPr>
+              <w:t>PUE moyen mondial 2025 : 1,14; pas de valeur Stockholm ni d'intensité carbone régionale publiée.</w:t>
+            </w:r>
+          </w:p>
+        </w:tc>
+        <w:tc>
+          <w:tcPr>
+            <w:tcW w:type="dxa" w:w="2268"/>
+          </w:tcPr>
+          <w:p>
+            <w:r>
+              <w:rPr>
+                <w:sz w:val="16"/>
+              </w:rPr>
+              <w:t>Même catalogue AWS; région UE, avec les mêmes réserves de juridiction du groupe.</w:t>
+            </w:r>
+          </w:p>
+        </w:tc>
+        <w:tc>
+          <w:tcPr>
+            <w:tcW w:type="dxa" w:w="2268"/>
+          </w:tcPr>
+          <w:p>
+            <w:r>
+              <w:rPr>
+                <w:sz w:val="16"/>
+              </w:rPr>
+              <w:t>À calculer au Pricing Calculator eu-north-1; tarif régional non vérifié ici.</w:t>
+            </w:r>
+          </w:p>
+        </w:tc>
+      </w:tr>
+      <w:tr>
+        <w:tc>
+          <w:tcPr>
+            <w:tcW w:type="dxa" w:w="2268"/>
+          </w:tcPr>
+          <w:p>
+            <w:r>
+              <w:rPr>
+                <w:sz w:val="16"/>
+              </w:rPr>
+              <w:t>OVHcloud France</w:t>
+            </w:r>
+          </w:p>
+        </w:tc>
+        <w:tc>
+          <w:tcPr>
+            <w:tcW w:type="dxa" w:w="2268"/>
+          </w:tcPr>
+          <w:p>
+            <w:r>
+              <w:rPr>
+                <w:sz w:val="16"/>
+              </w:rPr>
+              <w:t>PUE FY25 : Roubaix 1,30; Gravelines 1,21; Strasbourg 1,19. REF 100 % pour les sites listés; pas de valeur 3-AZ Paris dans le rapport.</w:t>
+            </w:r>
+          </w:p>
+        </w:tc>
+        <w:tc>
+          <w:tcPr>
+            <w:tcW w:type="dxa" w:w="2268"/>
+          </w:tcPr>
+          <w:p>
+            <w:r>
+              <w:rPr>
+                <w:sz w:val="16"/>
+              </w:rPr>
+              <w:t>ISO 50001; les certifications et SecNumCloud concernent des offres précises. Société française, vérifier service/contrat.</w:t>
+            </w:r>
+          </w:p>
+        </w:tc>
+        <w:tc>
+          <w:tcPr>
+            <w:tcW w:type="dxa" w:w="2268"/>
+          </w:tcPr>
+          <w:p>
+            <w:r>
+              <w:rPr>
+                <w:sz w:val="16"/>
+              </w:rPr>
+              <w:t>Tarif dynamique selon instance/région; devis identique à demander.</w:t>
+            </w:r>
+          </w:p>
+        </w:tc>
+      </w:tr>
+      <w:tr>
+        <w:tc>
+          <w:tcPr>
+            <w:tcW w:type="dxa" w:w="2268"/>
+          </w:tcPr>
+          <w:p>
+            <w:r>
+              <w:rPr>
+                <w:sz w:val="16"/>
+              </w:rPr>
+              <w:t>Scaleway Paris / PAR-1</w:t>
+            </w:r>
+          </w:p>
+        </w:tc>
+        <w:tc>
+          <w:tcPr>
+            <w:tcW w:type="dxa" w:w="2268"/>
+          </w:tcPr>
+          <w:p>
+            <w:r>
+              <w:rPr>
+                <w:sz w:val="16"/>
+              </w:rPr>
+              <w:t>PUE 2024 : DC2 1,45; DC3 1,39; DC4 1,44; DC5 1,25. Garanties d'origine éoliennes/hydrauliques déclarées à 100 %.</w:t>
+            </w:r>
+          </w:p>
+        </w:tc>
+        <w:tc>
+          <w:tcPr>
+            <w:tcW w:type="dxa" w:w="2268"/>
+          </w:tcPr>
+          <w:p>
+            <w:r>
+              <w:rPr>
+                <w:sz w:val="16"/>
+              </w:rPr>
+              <w:t>ISO/IEC 27001:2022, HDS; SecNumCloud en cours. Vérifier les sous-traitants et les termes contractuels.</w:t>
+            </w:r>
+          </w:p>
+        </w:tc>
+        <w:tc>
+          <w:tcPr>
+            <w:tcW w:type="dxa" w:w="2268"/>
+          </w:tcPr>
+          <w:p>
+            <w:r>
+              <w:rPr>
+                <w:sz w:val="16"/>
+              </w:rPr>
+              <w:t>BASIC3-X2C-4G, 2 vCPU/4 Go : 0,03945 €/h, env. 28,79 €/mois à 730 h; stockage et IPv4 attachée exclus.</w:t>
+            </w:r>
+          </w:p>
+        </w:tc>
+      </w:tr>
+    </w:tbl>
+    <w:p>
+      <w:r>
+        <w:t>Recommandation : le MVP reste local (0 € de cloud engagé). Pour un pilote, comparer Scaleway Paris et OVHcloud France à AWS Paris sur une configuration, disponibilité, sauvegarde et trafic identiques. Le PDF EdC-01 fourni ne prescrit pas AWS. Les PUE cités sont datés et non directement comparables entre méthodes et années.</w:t>
+      </w:r>
+    </w:p>
+    <w:p>
+      <w:r>
+        <w:t>Sources : https://sustainability.aboutamazon.com/products-services/aws-cloud ; https://aws.amazon.com/about-aws/global-infrastructure/regions_az/ ; https://corporate.ovhcloud.com/en/sustainability/environment/ ; https://www.ovhcloud.com/sites/default/files/external_files/kpis_fy25.pdf ; https://www.scaleway.com/en/environmental-leadership/ ; https://www.scaleway.com/en/pricing/virtual-instances/ .</w:t>
+      </w:r>
+    </w:p>
+    <w:p>
+      <w:pPr>
+        <w:pStyle w:val="Heading2"/>
+      </w:pPr>
+      <w:r>
         <w:t>Diagrammes exportés</w:t>
       </w:r>
     </w:p>

</xml_diff>